<commit_message>
fix(em): correct DANE INFORMACYJNE typo in template
EOF

Co-authored-by: Cursor <cursoragent@cursor.com>
</commit_message>
<xml_diff>
--- a/public/em-measurements/dane-informacyjne.template.docx
+++ b/public/em-measurements/dane-informacyjne.template.docx
@@ -58,7 +58,7 @@
           <w:sz w:val="36"/>
           <w:szCs w:val="36"/>
         </w:rPr>
-        <w:t>DANE INFORMACYJN5</w:t>
+        <w:t>DANE INFORMACYJNE</w:t>
       </w:r>
     </w:p>
     <w:p>
@@ -76,7 +76,7 @@
           <w:sz w:val="24"/>
           <w:szCs w:val="24"/>
         </w:rPr>
-        <w:t>Nr. {{RAP_NO}}   Data pomiaru {{MEASUREMENT_DATE}}</w:t>
+        <w:t>Nr</w:t>
       </w:r>
       <w:proofErr w:type="spellEnd"/>
       <w:r>
@@ -84,63 +84,39 @@
           <w:sz w:val="24"/>
           <w:szCs w:val="24"/>
         </w:rPr>
-        <w:t/>
+        <w:t>. {{</w:t>
       </w:r>
+      <w:proofErr w:type="spellStart"/>
       <w:r>
         <w:rPr>
           <w:sz w:val="24"/>
           <w:szCs w:val="24"/>
         </w:rPr>
-        <w:t/>
+        <w:t>RAP_NO</w:t>
       </w:r>
+      <w:proofErr w:type="spellEnd"/>
       <w:r>
         <w:rPr>
           <w:sz w:val="24"/>
           <w:szCs w:val="24"/>
         </w:rPr>
-        <w:t xml:space="preserve"/>
+        <w:t>}}   Data pomiaru {{</w:t>
       </w:r>
+      <w:proofErr w:type="spellStart"/>
       <w:r>
         <w:rPr>
           <w:sz w:val="24"/>
           <w:szCs w:val="24"/>
         </w:rPr>
-        <w:t/>
+        <w:t>MEASUREMENT_DATE</w:t>
       </w:r>
+      <w:proofErr w:type="spellEnd"/>
       <w:r>
         <w:rPr>
           <w:sz w:val="24"/>
           <w:szCs w:val="24"/>
         </w:rPr>
-        <w:t/>
-      </w:r>
-      <w:r>
-        <w:rPr>
-          <w:sz w:val="24"/>
-          <w:szCs w:val="24"/>
-        </w:rPr>
-        <w:t/>
-      </w:r>
-      <w:r>
-        <w:rPr>
-          <w:sz w:val="24"/>
-          <w:szCs w:val="24"/>
-        </w:rPr>
-        <w:t/>
-      </w:r>
-      <w:r>
-        <w:rPr>
-          <w:sz w:val="24"/>
-          <w:szCs w:val="24"/>
-        </w:rPr>
-        <w:t/>
-      </w:r>
-      <w:r>
-        <w:rPr>
-          <w:sz w:val="24"/>
-          <w:szCs w:val="24"/>
-        </w:rPr>
-        <w:t/>
+        <w:t>}}</w:t>
       </w:r>
     </w:p>
     <w:p>
@@ -159,13 +135,6 @@
         </w:rPr>
         <w:t>Pomiarowiec: {{TECHNICIAN}} {{TECHNICIAN_LICENSE}}</w:t>
       </w:r>
-      <w:r>
-        <w:rPr>
-          <w:sz w:val="24"/>
-          <w:szCs w:val="24"/>
-        </w:rPr>
-        <w:t/>
-      </w:r>
     </w:p>
     <w:p>
       <w:pPr>
@@ -192,14 +161,7 @@
           <w:sz w:val="20"/>
           <w:szCs w:val="20"/>
         </w:rPr>
-        <w:t xml:space="preserve">Miejsce pomiaru: {{ADDRESS}}</w:t>
-      </w:r>
-      <w:r>
-        <w:rPr>
-          <w:sz w:val="20"/>
-          <w:szCs w:val="20"/>
-        </w:rPr>
-        <w:t/>
+        <w:t>Miejsce pomiaru: {{ADDRESS}}</w:t>
       </w:r>
     </w:p>
     <w:p>
@@ -229,9 +191,9 @@
         <w:tblLook w:val="04A0"/>
       </w:tblPr>
       <w:tblGrid>
-        <w:gridCol w:w="533"/>
-        <w:gridCol w:w="7412"/>
-        <w:gridCol w:w="1343"/>
+        <w:gridCol w:w="528"/>
+        <w:gridCol w:w="7103"/>
+        <w:gridCol w:w="1657"/>
       </w:tblGrid>
       <w:tr>
         <w:tc>

</xml_diff>